<commit_message>
refine US Restaurant role
</commit_message>
<xml_diff>
--- a/Notice for Food Delivery.docx
+++ b/Notice for Food Delivery.docx
@@ -73,8 +73,6 @@
         </w:rPr>
         <w:t>Unaccepted</w:t>
       </w:r>
-      <w:bookmarkStart w:id="0" w:name="_GoBack"/>
-      <w:bookmarkEnd w:id="0"/>
     </w:p>
     <w:p>
       <w:pPr>
@@ -259,8 +257,10 @@
           <w:rFonts w:hint="default"/>
           <w:lang w:val="en-US"/>
         </w:rPr>
-        <w:t xml:space="preserve">US-7: Does it need to ensure Flexibility, </w:t>
-      </w:r>
+        <w:t>Thêm yếu tố measurable, testable.. cho Justification US</w:t>
+      </w:r>
+      <w:bookmarkStart w:id="0" w:name="_GoBack"/>
+      <w:bookmarkEnd w:id="0"/>
     </w:p>
     <w:p>
       <w:pPr>

</xml_diff>

<commit_message>
refine US of shipper role
</commit_message>
<xml_diff>
--- a/Notice for Food Delivery.docx
+++ b/Notice for Food Delivery.docx
@@ -259,8 +259,25 @@
         </w:rPr>
         <w:t>Thêm yếu tố measurable, testable.. (1 cột mới) cho mỗi US</w:t>
       </w:r>
-      <w:bookmarkStart w:id="0" w:name="_GoBack"/>
-      <w:bookmarkEnd w:id="0"/>
+    </w:p>
+    <w:p>
+      <w:pPr>
+        <w:numPr>
+          <w:ilvl w:val="0"/>
+          <w:numId w:val="2"/>
+        </w:numPr>
+        <w:rPr>
+          <w:rFonts w:hint="default"/>
+          <w:lang w:val="en-US"/>
+        </w:rPr>
+      </w:pPr>
+      <w:r>
+        <w:rPr>
+          <w:rFonts w:hint="default"/>
+          <w:lang w:val="en-US"/>
+        </w:rPr>
+        <w:t>Tìm yếu tố kiến trúc cho mỗi US</w:t>
+      </w:r>
     </w:p>
     <w:p>
       <w:pPr>
@@ -488,6 +505,15 @@
           <w:lang w:val="en-US"/>
         </w:rPr>
       </w:pPr>
+      <w:r>
+        <w:rPr>
+          <w:rFonts w:hint="default"/>
+          <w:lang w:val="en-US"/>
+        </w:rPr>
+        <w:t>User story</w:t>
+      </w:r>
+      <w:bookmarkStart w:id="0" w:name="_GoBack"/>
+      <w:bookmarkEnd w:id="0"/>
     </w:p>
     <w:p>
       <w:pPr>

</xml_diff>

<commit_message>
refine US for Platform
</commit_message>
<xml_diff>
--- a/Notice for Food Delivery.docx
+++ b/Notice for Food Delivery.docx
@@ -238,8 +238,140 @@
           <w:rFonts w:hint="default"/>
           <w:lang w:val="en-US"/>
         </w:rPr>
-        <w:t>Rarely use some quality attributes such as: Flexibility, Maintainability, Reusability, Manageability,  Supportability</w:t>
-      </w:r>
+        <w:t xml:space="preserve">Rarely use some quality attributes such as: </w:t>
+      </w:r>
+      <w:r>
+        <w:rPr>
+          <w:rFonts w:hint="default"/>
+          <w:color w:val="FF0000"/>
+          <w:lang w:val="en-US"/>
+        </w:rPr>
+        <w:t>Flexibility</w:t>
+      </w:r>
+      <w:r>
+        <w:rPr>
+          <w:rFonts w:hint="default"/>
+          <w:lang w:val="en-US"/>
+        </w:rPr>
+        <w:t xml:space="preserve">, </w:t>
+      </w:r>
+      <w:r>
+        <w:rPr>
+          <w:rFonts w:hint="default"/>
+          <w:color w:val="FF0000"/>
+          <w:lang w:val="en-US"/>
+        </w:rPr>
+        <w:t>Maintainability</w:t>
+      </w:r>
+      <w:r>
+        <w:rPr>
+          <w:rFonts w:hint="default"/>
+          <w:lang w:val="en-US"/>
+        </w:rPr>
+        <w:t xml:space="preserve">, </w:t>
+      </w:r>
+      <w:r>
+        <w:rPr>
+          <w:rFonts w:hint="default"/>
+          <w:color w:val="00B050"/>
+          <w:lang w:val="en-US"/>
+        </w:rPr>
+        <w:t>Reusability</w:t>
+      </w:r>
+      <w:r>
+        <w:rPr>
+          <w:rFonts w:hint="default"/>
+          <w:lang w:val="en-US"/>
+        </w:rPr>
+        <w:t xml:space="preserve">, </w:t>
+      </w:r>
+      <w:r>
+        <w:rPr>
+          <w:rFonts w:hint="default"/>
+          <w:color w:val="FF0000"/>
+          <w:lang w:val="en-US"/>
+        </w:rPr>
+        <w:t>Manageability</w:t>
+      </w:r>
+      <w:r>
+        <w:rPr>
+          <w:rFonts w:hint="default"/>
+          <w:lang w:val="en-US"/>
+        </w:rPr>
+        <w:t xml:space="preserve">,  </w:t>
+      </w:r>
+      <w:r>
+        <w:rPr>
+          <w:rFonts w:hint="default"/>
+          <w:color w:val="FF0000"/>
+          <w:lang w:val="en-US"/>
+        </w:rPr>
+        <w:t>Supportability</w:t>
+      </w:r>
+    </w:p>
+    <w:p>
+      <w:pPr>
+        <w:numPr>
+          <w:numId w:val="0"/>
+        </w:numPr>
+        <w:rPr>
+          <w:rFonts w:hint="default"/>
+          <w:lang w:val="en-US"/>
+        </w:rPr>
+      </w:pPr>
+    </w:p>
+    <w:p>
+      <w:pPr>
+        <w:keepNext w:val="0"/>
+        <w:keepLines w:val="0"/>
+        <w:widowControl/>
+        <w:suppressLineNumbers w:val="0"/>
+        <w:shd w:val="clear" w:fill="1F1F1F"/>
+        <w:spacing w:line="228" w:lineRule="atLeast"/>
+        <w:jc w:val="left"/>
+        <w:rPr>
+          <w:rFonts w:ascii="Consolas" w:hAnsi="Consolas" w:eastAsia="Consolas" w:cs="Consolas"/>
+          <w:b w:val="0"/>
+          <w:bCs w:val="0"/>
+          <w:color w:val="CCCCCC"/>
+          <w:sz w:val="16"/>
+          <w:szCs w:val="16"/>
+        </w:rPr>
+      </w:pPr>
+      <w:r>
+        <w:rPr>
+          <w:rFonts w:hint="default"/>
+          <w:lang w:val="vi-VN"/>
+        </w:rPr>
+        <w:t xml:space="preserve">- </w:t>
+      </w:r>
+      <w:r>
+        <w:rPr>
+          <w:rFonts w:hint="default" w:ascii="Consolas" w:hAnsi="Consolas" w:eastAsia="Consolas" w:cs="Consolas"/>
+          <w:b w:val="0"/>
+          <w:bCs w:val="0"/>
+          <w:color w:val="CCCCCC"/>
+          <w:kern w:val="0"/>
+          <w:sz w:val="16"/>
+          <w:szCs w:val="16"/>
+          <w:shd w:val="clear" w:fill="1F1F1F"/>
+          <w:lang w:val="en-US" w:eastAsia="zh-CN" w:bidi="ar"/>
+        </w:rPr>
+        <w:t>Reusability</w:t>
+      </w:r>
+      <w:bookmarkStart w:id="0" w:name="_GoBack"/>
+      <w:bookmarkEnd w:id="0"/>
+    </w:p>
+    <w:p>
+      <w:pPr>
+        <w:numPr>
+          <w:numId w:val="0"/>
+        </w:numPr>
+        <w:rPr>
+          <w:rFonts w:hint="default"/>
+          <w:lang w:val="vi-VN"/>
+        </w:rPr>
+      </w:pPr>
     </w:p>
     <w:p>
       <w:pPr>
@@ -257,7 +389,14 @@
           <w:rFonts w:hint="default"/>
           <w:lang w:val="en-US"/>
         </w:rPr>
-        <w:t>Thêm yếu tố measurable, testable.. (1 cột mới) cho mỗi US</w:t>
+        <w:t xml:space="preserve">Thêm yếu tố measurable, testable.. </w:t>
+      </w:r>
+      <w:r>
+        <w:rPr>
+          <w:rFonts w:hint="default"/>
+          <w:lang w:val="vi-VN"/>
+        </w:rPr>
+        <w:t>cho cột Quality attributes cho mỗi US</w:t>
       </w:r>
     </w:p>
     <w:p>
@@ -512,8 +651,6 @@
         </w:rPr>
         <w:t>User story</w:t>
       </w:r>
-      <w:bookmarkStart w:id="0" w:name="_GoBack"/>
-      <w:bookmarkEnd w:id="0"/>
     </w:p>
     <w:p>
       <w:pPr>

</xml_diff>

<commit_message>
add Reusability for US
</commit_message>
<xml_diff>
--- a/Notice for Food Delivery.docx
+++ b/Notice for Food Delivery.docx
@@ -211,12 +211,14 @@
         </w:numPr>
         <w:rPr>
           <w:rFonts w:hint="default"/>
-          <w:lang w:val="en-US"/>
-        </w:rPr>
-      </w:pPr>
-      <w:r>
-        <w:rPr>
-          <w:rFonts w:hint="default"/>
+          <w:color w:val="00B050"/>
+          <w:lang w:val="en-US"/>
+        </w:rPr>
+      </w:pPr>
+      <w:r>
+        <w:rPr>
+          <w:rFonts w:hint="default"/>
+          <w:color w:val="00B050"/>
           <w:lang w:val="en-US"/>
         </w:rPr>
         <w:t>- Valueate User stories:</w:t>
@@ -230,92 +232,35 @@
         </w:numPr>
         <w:rPr>
           <w:rFonts w:hint="default"/>
-          <w:lang w:val="en-US"/>
-        </w:rPr>
-      </w:pPr>
-      <w:r>
-        <w:rPr>
-          <w:rFonts w:hint="default"/>
-          <w:lang w:val="en-US"/>
-        </w:rPr>
-        <w:t xml:space="preserve">Rarely use some quality attributes such as: </w:t>
-      </w:r>
-      <w:r>
-        <w:rPr>
-          <w:rFonts w:hint="default"/>
-          <w:color w:val="FF0000"/>
-          <w:lang w:val="en-US"/>
-        </w:rPr>
-        <w:t>Flexibility</w:t>
-      </w:r>
-      <w:r>
-        <w:rPr>
-          <w:rFonts w:hint="default"/>
-          <w:lang w:val="en-US"/>
-        </w:rPr>
-        <w:t xml:space="preserve">, </w:t>
-      </w:r>
-      <w:r>
-        <w:rPr>
-          <w:rFonts w:hint="default"/>
-          <w:color w:val="FF0000"/>
-          <w:lang w:val="en-US"/>
-        </w:rPr>
-        <w:t>Maintainability</w:t>
-      </w:r>
-      <w:r>
-        <w:rPr>
-          <w:rFonts w:hint="default"/>
-          <w:lang w:val="en-US"/>
-        </w:rPr>
-        <w:t xml:space="preserve">, </w:t>
-      </w:r>
-      <w:r>
-        <w:rPr>
-          <w:rFonts w:hint="default"/>
           <w:color w:val="00B050"/>
           <w:lang w:val="en-US"/>
         </w:rPr>
-        <w:t>Reusability</w:t>
-      </w:r>
-      <w:r>
-        <w:rPr>
-          <w:rFonts w:hint="default"/>
-          <w:lang w:val="en-US"/>
-        </w:rPr>
-        <w:t xml:space="preserve">, </w:t>
-      </w:r>
-      <w:r>
-        <w:rPr>
-          <w:rFonts w:hint="default"/>
-          <w:color w:val="FF0000"/>
-          <w:lang w:val="en-US"/>
-        </w:rPr>
-        <w:t>Manageability</w:t>
-      </w:r>
-      <w:r>
-        <w:rPr>
-          <w:rFonts w:hint="default"/>
-          <w:lang w:val="en-US"/>
-        </w:rPr>
-        <w:t xml:space="preserve">,  </w:t>
-      </w:r>
-      <w:r>
-        <w:rPr>
-          <w:rFonts w:hint="default"/>
-          <w:color w:val="FF0000"/>
-          <w:lang w:val="en-US"/>
-        </w:rPr>
-        <w:t>Supportability</w:t>
-      </w:r>
-    </w:p>
-    <w:p>
-      <w:pPr>
-        <w:numPr>
-          <w:numId w:val="0"/>
-        </w:numPr>
-        <w:rPr>
-          <w:rFonts w:hint="default"/>
+      </w:pPr>
+      <w:r>
+        <w:rPr>
+          <w:rFonts w:hint="default"/>
+          <w:color w:val="00B050"/>
+          <w:lang w:val="en-US"/>
+        </w:rPr>
+        <w:t xml:space="preserve">Rarely use some quality attributes such as: Flexibility, Maintainability, </w:t>
+      </w:r>
+      <w:r>
+        <w:rPr>
+          <w:rFonts w:hint="default"/>
+          <w:color w:val="00B050"/>
+          <w:lang w:val="en-US"/>
+        </w:rPr>
+        <w:t>Reusability, Manageability,  Supportability</w:t>
+      </w:r>
+    </w:p>
+    <w:p>
+      <w:pPr>
+        <w:numPr>
+          <w:numId w:val="0"/>
+        </w:numPr>
+        <w:rPr>
+          <w:rFonts w:hint="default"/>
+          <w:color w:val="00B050"/>
           <w:lang w:val="en-US"/>
         </w:rPr>
       </w:pPr>
@@ -333,7 +278,7 @@
           <w:rFonts w:ascii="Consolas" w:hAnsi="Consolas" w:eastAsia="Consolas" w:cs="Consolas"/>
           <w:b w:val="0"/>
           <w:bCs w:val="0"/>
-          <w:color w:val="CCCCCC"/>
+          <w:color w:val="00B050"/>
           <w:sz w:val="16"/>
           <w:szCs w:val="16"/>
         </w:rPr>
@@ -341,6 +286,7 @@
       <w:r>
         <w:rPr>
           <w:rFonts w:hint="default"/>
+          <w:color w:val="00B050"/>
           <w:lang w:val="vi-VN"/>
         </w:rPr>
         <w:t xml:space="preserve">- </w:t>
@@ -350,7 +296,7 @@
           <w:rFonts w:hint="default" w:ascii="Consolas" w:hAnsi="Consolas" w:eastAsia="Consolas" w:cs="Consolas"/>
           <w:b w:val="0"/>
           <w:bCs w:val="0"/>
-          <w:color w:val="CCCCCC"/>
+          <w:color w:val="00B050"/>
           <w:kern w:val="0"/>
           <w:sz w:val="16"/>
           <w:szCs w:val="16"/>
@@ -359,34 +305,44 @@
         </w:rPr>
         <w:t>Reusability</w:t>
       </w:r>
+    </w:p>
+    <w:p>
+      <w:pPr>
+        <w:numPr>
+          <w:numId w:val="0"/>
+        </w:numPr>
+        <w:rPr>
+          <w:rFonts w:hint="default"/>
+          <w:color w:val="00B050"/>
+          <w:lang w:val="vi-VN"/>
+        </w:rPr>
+      </w:pPr>
+    </w:p>
+    <w:p>
+      <w:pPr>
+        <w:numPr>
+          <w:ilvl w:val="0"/>
+          <w:numId w:val="2"/>
+        </w:numPr>
+        <w:rPr>
+          <w:rFonts w:hint="default"/>
+          <w:color w:val="FF0000"/>
+          <w:lang w:val="en-US"/>
+        </w:rPr>
+      </w:pPr>
       <w:bookmarkStart w:id="0" w:name="_GoBack"/>
-      <w:bookmarkEnd w:id="0"/>
-    </w:p>
-    <w:p>
-      <w:pPr>
-        <w:numPr>
-          <w:numId w:val="0"/>
-        </w:numPr>
-        <w:rPr>
-          <w:rFonts w:hint="default"/>
+      <w:r>
+        <w:rPr>
+          <w:rFonts w:hint="default"/>
+          <w:color w:val="FF0000"/>
           <w:lang w:val="vi-VN"/>
         </w:rPr>
-      </w:pPr>
-    </w:p>
-    <w:p>
-      <w:pPr>
-        <w:numPr>
-          <w:ilvl w:val="0"/>
-          <w:numId w:val="2"/>
-        </w:numPr>
-        <w:rPr>
-          <w:rFonts w:hint="default"/>
-          <w:lang w:val="en-US"/>
-        </w:rPr>
-      </w:pPr>
-      <w:r>
-        <w:rPr>
-          <w:rFonts w:hint="default"/>
+        <w:t xml:space="preserve">HIện tại bạn đề xuất các yếu tố Quality attribute tui thấy ổn rồi, nhưng chúng có vẻ chưa measureable and testable. Giờ hãy </w:t>
+      </w:r>
+      <w:r>
+        <w:rPr>
+          <w:rFonts w:hint="default"/>
+          <w:color w:val="FF0000"/>
           <w:lang w:val="en-US"/>
         </w:rPr>
         <w:t xml:space="preserve">Thêm yếu tố measurable, testable.. </w:t>
@@ -394,11 +350,13 @@
       <w:r>
         <w:rPr>
           <w:rFonts w:hint="default"/>
+          <w:color w:val="FF0000"/>
           <w:lang w:val="vi-VN"/>
         </w:rPr>
-        <w:t>cho cột Quality attributes cho mỗi US</w:t>
-      </w:r>
-    </w:p>
+        <w:t>cho cột Quality attributes cho mỗi US để làm rõ là chúng cần phải làm tốt tới mức nào (thí dụ search phải phản hồi trong &lt; 2s.. gì đó)</w:t>
+      </w:r>
+    </w:p>
+    <w:bookmarkEnd w:id="0"/>
     <w:p>
       <w:pPr>
         <w:numPr>

</xml_diff>